<commit_message>
Update Xobriq KYC integration documentation
Co-Authored-By: Claude Sonnet 5 <noreply@anthropic.com>
</commit_message>
<xml_diff>
--- a/docs/Xobriq-KYC-Integration.docx
+++ b/docs/Xobriq-KYC-Integration.docx
@@ -350,6 +350,7 @@
     <w:p>
       <w:pPr>
         <w:pStyle w:val="ListNumber"/>
+        <w:jc w:val="both"/>
         <w:rPr>
           <w:rFonts w:ascii="Times New Roman" w:hAnsi="Times New Roman" w:cs="Times New Roman"/>
         </w:rPr>
@@ -371,6 +372,7 @@
     <w:p>
       <w:pPr>
         <w:pStyle w:val="ListNumber"/>
+        <w:jc w:val="both"/>
         <w:rPr>
           <w:rFonts w:ascii="Times New Roman" w:hAnsi="Times New Roman" w:cs="Times New Roman"/>
         </w:rPr>
@@ -392,6 +394,7 @@
     <w:p>
       <w:pPr>
         <w:pStyle w:val="ListNumber"/>
+        <w:jc w:val="both"/>
         <w:rPr>
           <w:rFonts w:ascii="Times New Roman" w:hAnsi="Times New Roman" w:cs="Times New Roman"/>
         </w:rPr>
@@ -412,6 +415,7 @@
     </w:p>
     <w:p>
       <w:pPr>
+        <w:jc w:val="both"/>
         <w:rPr>
           <w:rFonts w:ascii="Times New Roman" w:hAnsi="Times New Roman" w:cs="Times New Roman"/>
         </w:rPr>
@@ -439,6 +443,7 @@
     </w:p>
     <w:p>
       <w:pPr>
+        <w:jc w:val="both"/>
         <w:rPr>
           <w:rFonts w:ascii="Times New Roman" w:hAnsi="Times New Roman" w:cs="Times New Roman"/>
         </w:rPr>
@@ -468,6 +473,7 @@
     <w:p>
       <w:pPr>
         <w:pStyle w:val="ListBullet"/>
+        <w:jc w:val="both"/>
         <w:rPr>
           <w:rFonts w:ascii="Times New Roman" w:hAnsi="Times New Roman" w:cs="Times New Roman"/>
         </w:rPr>
@@ -489,6 +495,7 @@
     <w:p>
       <w:pPr>
         <w:pStyle w:val="ListBullet"/>
+        <w:jc w:val="both"/>
         <w:rPr>
           <w:rFonts w:ascii="Times New Roman" w:hAnsi="Times New Roman" w:cs="Times New Roman"/>
         </w:rPr>
@@ -510,6 +517,7 @@
     <w:p>
       <w:pPr>
         <w:pStyle w:val="ListBullet"/>
+        <w:jc w:val="both"/>
         <w:rPr>
           <w:rFonts w:ascii="Times New Roman" w:hAnsi="Times New Roman" w:cs="Times New Roman"/>
         </w:rPr>
@@ -672,7 +680,21 @@
               <w:rPr>
                 <w:rFonts w:ascii="Times New Roman" w:hAnsi="Times New Roman" w:cs="Times New Roman"/>
               </w:rPr>
-              <w:t>One internal wallet per account, used by this dashboard to track its own notional balance/spend (independent of Xobriq's own production billing).</w:t>
+              <w:t xml:space="preserve">One internal wallet per account, used by this dashboard to track its own notional balance/spend (independent of </w:t>
+            </w:r>
+            <w:proofErr w:type="spellStart"/>
+            <w:r>
+              <w:rPr>
+                <w:rFonts w:ascii="Times New Roman" w:hAnsi="Times New Roman" w:cs="Times New Roman"/>
+              </w:rPr>
+              <w:t>Xobriq's</w:t>
+            </w:r>
+            <w:proofErr w:type="spellEnd"/>
+            <w:r>
+              <w:rPr>
+                <w:rFonts w:ascii="Times New Roman" w:hAnsi="Times New Roman" w:cs="Times New Roman"/>
+              </w:rPr>
+              <w:t xml:space="preserve"> own production billing).</w:t>
             </w:r>
           </w:p>
         </w:tc>
@@ -770,6 +792,7 @@
     <w:p>
       <w:pPr>
         <w:pStyle w:val="ListBullet"/>
+        <w:jc w:val="both"/>
         <w:rPr>
           <w:rFonts w:ascii="Times New Roman" w:hAnsi="Times New Roman" w:cs="Times New Roman"/>
         </w:rPr>
@@ -791,6 +814,7 @@
     <w:p>
       <w:pPr>
         <w:pStyle w:val="ListBullet"/>
+        <w:jc w:val="both"/>
         <w:rPr>
           <w:rFonts w:ascii="Times New Roman" w:hAnsi="Times New Roman" w:cs="Times New Roman"/>
         </w:rPr>
@@ -825,6 +849,7 @@
     </w:p>
     <w:p>
       <w:pPr>
+        <w:jc w:val="both"/>
         <w:rPr>
           <w:rFonts w:ascii="Times New Roman" w:hAnsi="Times New Roman" w:cs="Times New Roman"/>
         </w:rPr>
@@ -852,6 +877,7 @@
     </w:p>
     <w:p>
       <w:pPr>
+        <w:jc w:val="both"/>
         <w:rPr>
           <w:rFonts w:ascii="Times New Roman" w:hAnsi="Times New Roman" w:cs="Times New Roman"/>
         </w:rPr>
@@ -1141,6 +1167,7 @@
     </w:tbl>
     <w:p>
       <w:pPr>
+        <w:jc w:val="both"/>
         <w:rPr>
           <w:rFonts w:ascii="Times New Roman" w:hAnsi="Times New Roman" w:cs="Times New Roman"/>
         </w:rPr>
@@ -1168,6 +1195,7 @@
     </w:p>
     <w:p>
       <w:pPr>
+        <w:jc w:val="both"/>
         <w:rPr>
           <w:rFonts w:ascii="Times New Roman" w:hAnsi="Times New Roman" w:cs="Times New Roman"/>
         </w:rPr>
@@ -1196,6 +1224,7 @@
     <w:p>
       <w:pPr>
         <w:pStyle w:val="ListBullet"/>
+        <w:jc w:val="both"/>
         <w:rPr>
           <w:rFonts w:ascii="Times New Roman" w:hAnsi="Times New Roman" w:cs="Times New Roman"/>
         </w:rPr>
@@ -1217,6 +1246,7 @@
     <w:p>
       <w:pPr>
         <w:pStyle w:val="ListBullet"/>
+        <w:jc w:val="both"/>
         <w:rPr>
           <w:rFonts w:ascii="Times New Roman" w:hAnsi="Times New Roman" w:cs="Times New Roman"/>
         </w:rPr>
@@ -1238,6 +1268,7 @@
     <w:p>
       <w:pPr>
         <w:pStyle w:val="ListBullet"/>
+        <w:jc w:val="both"/>
         <w:rPr>
           <w:rFonts w:ascii="Times New Roman" w:hAnsi="Times New Roman" w:cs="Times New Roman"/>
         </w:rPr>

</xml_diff>